<commit_message>
docs: replace em-dashes with hyphens in retrospective
Co-Authored-By: Claude Opus 4.8 (1M context) <noreply@anthropic.com>
</commit_message>
<xml_diff>
--- a/docs/cogniro-retrospektywa.docx
+++ b/docs/cogniro-retrospektywa.docx
@@ -35,7 +35,7 @@
           <w:color w:val="1A1A1A"/>
           <w:sz w:val="24"/>
         </w:rPr>
-        <w:t>Problem z estymowaniem godzin przez różne godziny pracy studentów — ciężko się to walidowało.</w:t>
+        <w:t>Problem z estymowaniem godzin przez różne godziny pracy studentów - ciężko się to walidowało.</w:t>
       </w:r>
     </w:p>
     <w:p>
@@ -179,7 +179,7 @@
           <w:color w:val="1A1A1A"/>
           <w:sz w:val="24"/>
         </w:rPr>
-        <w:t>Linear jest świetnym narzędziem do monitorowania postępów pracy — umożliwia szczegółowe statystyki, co ułatwia równomierne rozdzielanie zadań między członków zespołu.</w:t>
+        <w:t>Linear jest świetnym narzędziem do monitorowania postępów pracy - umożliwia szczegółowe statystyki, co ułatwia równomierne rozdzielanie zadań między członków zespołu.</w:t>
       </w:r>
     </w:p>
     <w:sectPr>

</xml_diff>

<commit_message>
docs: add point on useful weekly meetings to retrospective
Co-Authored-By: Claude Opus 4.8 (1M context) <noreply@anthropic.com>
</commit_message>
<xml_diff>
--- a/docs/cogniro-retrospektywa.docx
+++ b/docs/cogniro-retrospektywa.docx
@@ -162,6 +162,24 @@
           <w:sz w:val="24"/>
         </w:rPr>
         <w:t>Komunikacja za pomocą dedykowanego narzędzia ułatwiała komunikację w zespole, a skonfigurowane automatyczne powiadomienia ułatwiały przekazywanie informacji o postępach.</w:t>
+      </w:r>
+    </w:p>
+    <w:p>
+      <w:pPr>
+        <w:shd w:val="clear" w:color="auto" w:fill="F4F8FC"/>
+        <w:pBdr>
+          <w:left w:val="single" w:sz="24" w:space="8" w:color="1F4E79"/>
+        </w:pBdr>
+        <w:spacing w:after="160" w:before="40"/>
+        <w:ind w:left="120"/>
+      </w:pPr>
+      <w:r>
+        <w:rPr>
+          <w:rFonts w:ascii="Calibri" w:hAnsi="Calibri"/>
+          <w:color w:val="1A1A1A"/>
+          <w:sz w:val="24"/>
+        </w:rPr>
+        <w:t>Cotygodniowe spotkania zespołu były przydatne - pozwalały na bieżąco aktualizować postęp prac i utrzymywać wspólny rytm pracy.</w:t>
       </w:r>
     </w:p>
     <w:p>

</xml_diff>

<commit_message>
docs: rewrite retrospective in full sentences, add blockers, drop AI-views note
Co-Authored-By: Claude Opus 4.8 (1M context) <noreply@anthropic.com>
</commit_message>
<xml_diff>
--- a/docs/cogniro-retrospektywa.docx
+++ b/docs/cogniro-retrospektywa.docx
@@ -22,20 +22,16 @@
     </w:p>
     <w:p>
       <w:pPr>
-        <w:shd w:val="clear" w:color="auto" w:fill="F4F8FC"/>
-        <w:pBdr>
-          <w:left w:val="single" w:sz="24" w:space="8" w:color="1F4E79"/>
-        </w:pBdr>
-        <w:spacing w:after="160" w:before="40"/>
-        <w:ind w:left="120"/>
+        <w:spacing w:before="280" w:after="120"/>
       </w:pPr>
       <w:r>
         <w:rPr>
           <w:rFonts w:ascii="Calibri" w:hAnsi="Calibri"/>
-          <w:color w:val="1A1A1A"/>
-          <w:sz w:val="24"/>
+          <w:b/>
+          <w:color w:val="1F4E79"/>
+          <w:sz w:val="30"/>
         </w:rPr>
-        <w:t>Problem z estymowaniem godzin przez różne godziny pracy studentów - ciężko się to walidowało.</w:t>
+        <w:t>Co działało dobrze</w:t>
       </w:r>
     </w:p>
     <w:p>
@@ -53,7 +49,7 @@
           <w:color w:val="1A1A1A"/>
           <w:sz w:val="24"/>
         </w:rPr>
-        <w:t>Problemy z estymatami początkowymi: brak refleksji, a to proste, to będzie szybkie. Udało się to potem naprawić poprzez poświęcenie większej ilości czasu na analizę zadań.</w:t>
+        <w:t>Rozdzielanie dużych zadań na mniejsze okazało się przydatne, ponieważ przyspieszało realizację pracy i nie blokowało kolejnych zadań.</w:t>
       </w:r>
     </w:p>
     <w:p>
@@ -71,43 +67,7 @@
           <w:color w:val="1A1A1A"/>
           <w:sz w:val="24"/>
         </w:rPr>
-        <w:t>Rozdzielanie dużych zadań na mniejsze było przydatne przy przyspieszaniu realizacji pracy i niezablokowaniu kolejnych zadań.</w:t>
-      </w:r>
-    </w:p>
-    <w:p>
-      <w:pPr>
-        <w:shd w:val="clear" w:color="auto" w:fill="F4F8FC"/>
-        <w:pBdr>
-          <w:left w:val="single" w:sz="24" w:space="8" w:color="1F4E79"/>
-        </w:pBdr>
-        <w:spacing w:after="160" w:before="40"/>
-        <w:ind w:left="120"/>
-      </w:pPr>
-      <w:r>
-        <w:rPr>
-          <w:rFonts w:ascii="Calibri" w:hAnsi="Calibri"/>
-          <w:color w:val="1A1A1A"/>
-          <w:sz w:val="24"/>
-        </w:rPr>
-        <w:t>QA był przesadnie, nieproporcjonalnie obciążony. Najlepiej byłoby, gdyby każda osoba pełniła jego funkcję, a zamiast QA była osoba odpowiedzialna za UX.</w:t>
-      </w:r>
-    </w:p>
-    <w:p>
-      <w:pPr>
-        <w:shd w:val="clear" w:color="auto" w:fill="F4F8FC"/>
-        <w:pBdr>
-          <w:left w:val="single" w:sz="24" w:space="8" w:color="1F4E79"/>
-        </w:pBdr>
-        <w:spacing w:after="160" w:before="40"/>
-        <w:ind w:left="120"/>
-      </w:pPr>
-      <w:r>
-        <w:rPr>
-          <w:rFonts w:ascii="Calibri" w:hAnsi="Calibri"/>
-          <w:color w:val="1A1A1A"/>
-          <w:sz w:val="24"/>
-        </w:rPr>
-        <w:t>Przyjemne doświadczenie: zrealizować projekt e2e na łamach tego przedmiotu daje doświadczenie.</w:t>
+        <w:t>Realizacja projektu end-to-end w ramach tego przedmiotu była przyjemnym doświadczeniem i dała nam realne, praktyczne umiejętności.</w:t>
       </w:r>
     </w:p>
     <w:p>
@@ -143,7 +103,7 @@
           <w:color w:val="1A1A1A"/>
           <w:sz w:val="24"/>
         </w:rPr>
-        <w:t>Automatyzacja zadań, między innymi automatyczne testy kodu, pipeline'y, AI do generowania widoków z narzędzia graficznego.</w:t>
+        <w:t>Pomocna była automatyzacja zadań, między innymi automatyczne testy kodu oraz pipeline'y.</w:t>
       </w:r>
     </w:p>
     <w:p>
@@ -161,7 +121,7 @@
           <w:color w:val="1A1A1A"/>
           <w:sz w:val="24"/>
         </w:rPr>
-        <w:t>Komunikacja za pomocą dedykowanego narzędzia ułatwiała komunikację w zespole, a skonfigurowane automatyczne powiadomienia ułatwiały przekazywanie informacji o postępach.</w:t>
+        <w:t>Komunikacja za pomocą dedykowanego narzędzia ułatwiała współpracę w zespole, a skonfigurowane automatyczne powiadomienia ułatwiały przekazywanie informacji o postępach.</w:t>
       </w:r>
     </w:p>
     <w:p>
@@ -179,7 +139,7 @@
           <w:color w:val="1A1A1A"/>
           <w:sz w:val="24"/>
         </w:rPr>
-        <w:t>Cotygodniowe spotkania zespołu były przydatne - pozwalały na bieżąco aktualizować postęp prac i utrzymywać wspólny rytm pracy.</w:t>
+        <w:t>Cotygodniowe spotkania zespołu były przydatne, ponieważ pozwalały na bieżąco aktualizować postęp prac i utrzymywać wspólny rytm pracy.</w:t>
       </w:r>
     </w:p>
     <w:p>
@@ -197,7 +157,143 @@
           <w:color w:val="1A1A1A"/>
           <w:sz w:val="24"/>
         </w:rPr>
-        <w:t>Linear jest świetnym narzędziem do monitorowania postępów pracy - umożliwia szczegółowe statystyki, co ułatwia równomierne rozdzielanie zadań między członków zespołu.</w:t>
+        <w:t>Linear okazał się świetnym narzędziem do monitorowania postępów pracy, ponieważ udostępniał szczegółowe statystyki, które ułatwiały równomierne rozdzielanie zadań między członków zespołu.</w:t>
+      </w:r>
+    </w:p>
+    <w:p>
+      <w:pPr>
+        <w:spacing w:before="280" w:after="120"/>
+      </w:pPr>
+      <w:r>
+        <w:rPr>
+          <w:rFonts w:ascii="Calibri" w:hAnsi="Calibri"/>
+          <w:b/>
+          <w:color w:val="1F4E79"/>
+          <w:sz w:val="30"/>
+        </w:rPr>
+        <w:t>Problemy i wyzwania</w:t>
+      </w:r>
+    </w:p>
+    <w:p>
+      <w:pPr>
+        <w:shd w:val="clear" w:color="auto" w:fill="F4F8FC"/>
+        <w:pBdr>
+          <w:left w:val="single" w:sz="24" w:space="8" w:color="1F4E79"/>
+        </w:pBdr>
+        <w:spacing w:after="160" w:before="40"/>
+        <w:ind w:left="120"/>
+      </w:pPr>
+      <w:r>
+        <w:rPr>
+          <w:rFonts w:ascii="Calibri" w:hAnsi="Calibri"/>
+          <w:color w:val="1A1A1A"/>
+          <w:sz w:val="24"/>
+        </w:rPr>
+        <w:t>Mieliśmy problem z estymowaniem godzin, ponieważ studenci pracowali w różnych godzinach, przez co trudno było te estymaty walidować.</w:t>
+      </w:r>
+    </w:p>
+    <w:p>
+      <w:pPr>
+        <w:shd w:val="clear" w:color="auto" w:fill="F4F8FC"/>
+        <w:pBdr>
+          <w:left w:val="single" w:sz="24" w:space="8" w:color="1F4E79"/>
+        </w:pBdr>
+        <w:spacing w:after="160" w:before="40"/>
+        <w:ind w:left="120"/>
+      </w:pPr>
+      <w:r>
+        <w:rPr>
+          <w:rFonts w:ascii="Calibri" w:hAnsi="Calibri"/>
+          <w:color w:val="1A1A1A"/>
+          <w:sz w:val="24"/>
+        </w:rPr>
+        <w:t>Początkowe estymaty sprawiały problemy, ponieważ podchodziliśmy do nich bez refleksji, z założeniem, że zadanie jest proste i pójdzie szybko. Udało się to później naprawić, poświęcając więcej czasu na analizę zadań.</w:t>
+      </w:r>
+    </w:p>
+    <w:p>
+      <w:pPr>
+        <w:shd w:val="clear" w:color="auto" w:fill="F4F8FC"/>
+        <w:pBdr>
+          <w:left w:val="single" w:sz="24" w:space="8" w:color="1F4E79"/>
+        </w:pBdr>
+        <w:spacing w:after="160" w:before="40"/>
+        <w:ind w:left="120"/>
+      </w:pPr>
+      <w:r>
+        <w:rPr>
+          <w:rFonts w:ascii="Calibri" w:hAnsi="Calibri"/>
+          <w:color w:val="1A1A1A"/>
+          <w:sz w:val="24"/>
+        </w:rPr>
+        <w:t>Rola QA była przesadnie i nieproporcjonalnie obciążona. Lepszym rozwiązaniem byłoby, gdyby funkcję QA pełniła każda osoba w zespole, a w jej miejsce pojawiła się osoba odpowiedzialna za UX.</w:t>
+      </w:r>
+    </w:p>
+    <w:p>
+      <w:pPr>
+        <w:spacing w:before="280" w:after="120"/>
+      </w:pPr>
+      <w:r>
+        <w:rPr>
+          <w:rFonts w:ascii="Calibri" w:hAnsi="Calibri"/>
+          <w:b/>
+          <w:color w:val="1F4E79"/>
+          <w:sz w:val="30"/>
+        </w:rPr>
+        <w:t>Blockery</w:t>
+      </w:r>
+    </w:p>
+    <w:p>
+      <w:pPr>
+        <w:shd w:val="clear" w:color="auto" w:fill="F4F8FC"/>
+        <w:pBdr>
+          <w:left w:val="single" w:sz="24" w:space="8" w:color="1F4E79"/>
+        </w:pBdr>
+        <w:spacing w:after="160" w:before="40"/>
+        <w:ind w:left="120"/>
+      </w:pPr>
+      <w:r>
+        <w:rPr>
+          <w:rFonts w:ascii="Calibri" w:hAnsi="Calibri"/>
+          <w:color w:val="1A1A1A"/>
+          <w:sz w:val="24"/>
+        </w:rPr>
+        <w:t>Najczęstszym blockerem były wzajemne zależności między zadaniami, ponieważ oczekiwanie na cudzą pracę potrafiło zablokować kolejne osoby nawet na cały tydzień.</w:t>
+      </w:r>
+    </w:p>
+    <w:p>
+      <w:pPr>
+        <w:shd w:val="clear" w:color="auto" w:fill="F4F8FC"/>
+        <w:pBdr>
+          <w:left w:val="single" w:sz="24" w:space="8" w:color="1F4E79"/>
+        </w:pBdr>
+        <w:spacing w:after="160" w:before="40"/>
+        <w:ind w:left="120"/>
+      </w:pPr>
+      <w:r>
+        <w:rPr>
+          <w:rFonts w:ascii="Calibri" w:hAnsi="Calibri"/>
+          <w:color w:val="1A1A1A"/>
+          <w:sz w:val="24"/>
+        </w:rPr>
+        <w:t>Wąskim gardłem bywało też review oraz QA, które wstrzymywało scalanie zmian i rozpoczęcie kolejnych zadań.</w:t>
+      </w:r>
+    </w:p>
+    <w:p>
+      <w:pPr>
+        <w:shd w:val="clear" w:color="auto" w:fill="F4F8FC"/>
+        <w:pBdr>
+          <w:left w:val="single" w:sz="24" w:space="8" w:color="1F4E79"/>
+        </w:pBdr>
+        <w:spacing w:after="160" w:before="40"/>
+        <w:ind w:left="120"/>
+      </w:pPr>
+      <w:r>
+        <w:rPr>
+          <w:rFonts w:ascii="Calibri" w:hAnsi="Calibri"/>
+          <w:color w:val="1A1A1A"/>
+          <w:sz w:val="24"/>
+        </w:rPr>
+        <w:t>Część blockerów wynikała ze zbyt dużych zadań oraz braku jasno określonego zakresu pracy na dany moment, dlatego pomagało dzielenie ticketów na mniejsze i wcześniejsze doprecyzowanie zadań.</w:t>
       </w:r>
     </w:p>
     <w:sectPr>

</xml_diff>

<commit_message>
docs: add project stats charts (git data) and team survey to retrospective
Co-Authored-By: Claude Opus 4.8 (1M context) <noreply@anthropic.com>
</commit_message>
<xml_diff>
--- a/docs/cogniro-retrospektywa.docx
+++ b/docs/cogniro-retrospektywa.docx
@@ -294,6 +294,378 @@
           <w:sz w:val="24"/>
         </w:rPr>
         <w:t>Część blockerów wynikała ze zbyt dużych zadań oraz braku jasno określonego zakresu pracy na dany moment, dlatego pomagało dzielenie ticketów na mniejsze i wcześniejsze doprecyzowanie zadań.</w:t>
+      </w:r>
+    </w:p>
+    <w:p>
+      <w:pPr>
+        <w:spacing w:before="280" w:after="120"/>
+      </w:pPr>
+      <w:r>
+        <w:rPr>
+          <w:rFonts w:ascii="Calibri" w:hAnsi="Calibri"/>
+          <w:b/>
+          <w:color w:val="1F4E79"/>
+          <w:sz w:val="30"/>
+        </w:rPr>
+        <w:t>Statystyki projektu</w:t>
+      </w:r>
+    </w:p>
+    <w:p>
+      <w:pPr>
+        <w:spacing w:after="200"/>
+      </w:pPr>
+      <w:r>
+        <w:rPr>
+          <w:rFonts w:ascii="Calibri" w:hAnsi="Calibri"/>
+          <w:i/>
+          <w:color w:val="555555"/>
+          <w:sz w:val="20"/>
+        </w:rPr>
+        <w:t>Okres realizacji: 10.03–13.06.2026 (ok. 3 miesiące).  Zmergowanych PR-ów: 36.  Kontrybutorów: 6.  Commitów na gałęzi main: 37.</w:t>
+      </w:r>
+    </w:p>
+    <w:p>
+      <w:pPr>
+        <w:spacing w:after="200"/>
+        <w:jc w:val="center"/>
+      </w:pPr>
+      <w:r>
+        <w:drawing>
+          <wp:inline xmlns:a="http://schemas.openxmlformats.org/drawingml/2006/main" xmlns:pic="http://schemas.openxmlformats.org/drawingml/2006/picture">
+            <wp:extent cx="5760000" cy="2488889"/>
+            <wp:docPr id="1" name="Picture 1"/>
+            <wp:cNvGraphicFramePr>
+              <a:graphicFrameLocks noChangeAspect="1"/>
+            </wp:cNvGraphicFramePr>
+            <a:graphic>
+              <a:graphicData uri="http://schemas.openxmlformats.org/drawingml/2006/picture">
+                <pic:pic>
+                  <pic:nvPicPr>
+                    <pic:cNvPr id="0" name="chart_authors.png"/>
+                    <pic:cNvPicPr/>
+                  </pic:nvPicPr>
+                  <pic:blipFill>
+                    <a:blip r:embed="rId9"/>
+                    <a:stretch>
+                      <a:fillRect/>
+                    </a:stretch>
+                  </pic:blipFill>
+                  <pic:spPr>
+                    <a:xfrm>
+                      <a:off x="0" y="0"/>
+                      <a:ext cx="5760000" cy="2488889"/>
+                    </a:xfrm>
+                    <a:prstGeom prst="rect"/>
+                  </pic:spPr>
+                </pic:pic>
+              </a:graphicData>
+            </a:graphic>
+          </wp:inline>
+        </w:drawing>
+      </w:r>
+    </w:p>
+    <w:p>
+      <w:pPr>
+        <w:spacing w:after="200"/>
+        <w:jc w:val="center"/>
+      </w:pPr>
+      <w:r>
+        <w:drawing>
+          <wp:inline xmlns:a="http://schemas.openxmlformats.org/drawingml/2006/main" xmlns:pic="http://schemas.openxmlformats.org/drawingml/2006/picture">
+            <wp:extent cx="5760000" cy="2346667"/>
+            <wp:docPr id="2" name="Picture 2"/>
+            <wp:cNvGraphicFramePr>
+              <a:graphicFrameLocks noChangeAspect="1"/>
+            </wp:cNvGraphicFramePr>
+            <a:graphic>
+              <a:graphicData uri="http://schemas.openxmlformats.org/drawingml/2006/picture">
+                <pic:pic>
+                  <pic:nvPicPr>
+                    <pic:cNvPr id="0" name="chart_timeline.png"/>
+                    <pic:cNvPicPr/>
+                  </pic:nvPicPr>
+                  <pic:blipFill>
+                    <a:blip r:embed="rId10"/>
+                    <a:stretch>
+                      <a:fillRect/>
+                    </a:stretch>
+                  </pic:blipFill>
+                  <pic:spPr>
+                    <a:xfrm>
+                      <a:off x="0" y="0"/>
+                      <a:ext cx="5760000" cy="2346667"/>
+                    </a:xfrm>
+                    <a:prstGeom prst="rect"/>
+                  </pic:spPr>
+                </pic:pic>
+              </a:graphicData>
+            </a:graphic>
+          </wp:inline>
+        </w:drawing>
+      </w:r>
+    </w:p>
+    <w:p>
+      <w:pPr>
+        <w:spacing w:before="280" w:after="120"/>
+      </w:pPr>
+      <w:r>
+        <w:rPr>
+          <w:rFonts w:ascii="Calibri" w:hAnsi="Calibri"/>
+          <w:b/>
+          <w:color w:val="1F4E79"/>
+          <w:sz w:val="30"/>
+        </w:rPr>
+        <w:t>Ankieta zespołowa</w:t>
+      </w:r>
+    </w:p>
+    <w:p>
+      <w:pPr>
+        <w:spacing w:after="160"/>
+      </w:pPr>
+      <w:r>
+        <w:rPr>
+          <w:rFonts w:ascii="Calibri" w:hAnsi="Calibri"/>
+          <w:i/>
+          <w:color w:val="555555"/>
+          <w:sz w:val="20"/>
+        </w:rPr>
+        <w:t>Krótka ankieta do wypełnienia przez członków zespołu. Skala 1-5, gdzie 1 = zdecydowanie nie, 5 = zdecydowanie tak.</w:t>
+      </w:r>
+    </w:p>
+    <w:p>
+      <w:pPr>
+        <w:spacing w:after="80"/>
+      </w:pPr>
+      <w:r>
+        <w:rPr>
+          <w:rFonts w:ascii="Calibri" w:hAnsi="Calibri"/>
+          <w:color w:val="1A1A1A"/>
+          <w:sz w:val="22"/>
+        </w:rPr>
+        <w:t xml:space="preserve">Estymaty czasu były realistyczne.    </w:t>
+      </w:r>
+      <w:r>
+        <w:rPr>
+          <w:rFonts w:ascii="Calibri" w:hAnsi="Calibri"/>
+          <w:color w:val="555555"/>
+          <w:sz w:val="22"/>
+        </w:rPr>
+        <w:t>Ocena (1-5):  1   2   3   4   5</w:t>
+      </w:r>
+    </w:p>
+    <w:p>
+      <w:pPr>
+        <w:spacing w:after="80"/>
+      </w:pPr>
+      <w:r>
+        <w:rPr>
+          <w:rFonts w:ascii="Calibri" w:hAnsi="Calibri"/>
+          <w:color w:val="1A1A1A"/>
+          <w:sz w:val="22"/>
+        </w:rPr>
+        <w:t xml:space="preserve">Podział dużych zadań na mniejsze usprawniał pracę.    </w:t>
+      </w:r>
+      <w:r>
+        <w:rPr>
+          <w:rFonts w:ascii="Calibri" w:hAnsi="Calibri"/>
+          <w:color w:val="555555"/>
+          <w:sz w:val="22"/>
+        </w:rPr>
+        <w:t>Ocena (1-5):  1   2   3   4   5</w:t>
+      </w:r>
+    </w:p>
+    <w:p>
+      <w:pPr>
+        <w:spacing w:after="80"/>
+      </w:pPr>
+      <w:r>
+        <w:rPr>
+          <w:rFonts w:ascii="Calibri" w:hAnsi="Calibri"/>
+          <w:color w:val="1A1A1A"/>
+          <w:sz w:val="22"/>
+        </w:rPr>
+        <w:t xml:space="preserve">Obciążenie rolą QA było rozłożone sprawiedliwie.    </w:t>
+      </w:r>
+      <w:r>
+        <w:rPr>
+          <w:rFonts w:ascii="Calibri" w:hAnsi="Calibri"/>
+          <w:color w:val="555555"/>
+          <w:sz w:val="22"/>
+        </w:rPr>
+        <w:t>Ocena (1-5):  1   2   3   4   5</w:t>
+      </w:r>
+    </w:p>
+    <w:p>
+      <w:pPr>
+        <w:spacing w:after="80"/>
+      </w:pPr>
+      <w:r>
+        <w:rPr>
+          <w:rFonts w:ascii="Calibri" w:hAnsi="Calibri"/>
+          <w:color w:val="1A1A1A"/>
+          <w:sz w:val="22"/>
+        </w:rPr>
+        <w:t xml:space="preserve">Komunikacja w zespole była efektywna.    </w:t>
+      </w:r>
+      <w:r>
+        <w:rPr>
+          <w:rFonts w:ascii="Calibri" w:hAnsi="Calibri"/>
+          <w:color w:val="555555"/>
+          <w:sz w:val="22"/>
+        </w:rPr>
+        <w:t>Ocena (1-5):  1   2   3   4   5</w:t>
+      </w:r>
+    </w:p>
+    <w:p>
+      <w:pPr>
+        <w:spacing w:after="80"/>
+      </w:pPr>
+      <w:r>
+        <w:rPr>
+          <w:rFonts w:ascii="Calibri" w:hAnsi="Calibri"/>
+          <w:color w:val="1A1A1A"/>
+          <w:sz w:val="22"/>
+        </w:rPr>
+        <w:t xml:space="preserve">Cotygodniowe spotkania były przydatne.    </w:t>
+      </w:r>
+      <w:r>
+        <w:rPr>
+          <w:rFonts w:ascii="Calibri" w:hAnsi="Calibri"/>
+          <w:color w:val="555555"/>
+          <w:sz w:val="22"/>
+        </w:rPr>
+        <w:t>Ocena (1-5):  1   2   3   4   5</w:t>
+      </w:r>
+    </w:p>
+    <w:p>
+      <w:pPr>
+        <w:spacing w:after="80"/>
+      </w:pPr>
+      <w:r>
+        <w:rPr>
+          <w:rFonts w:ascii="Calibri" w:hAnsi="Calibri"/>
+          <w:color w:val="1A1A1A"/>
+          <w:sz w:val="22"/>
+        </w:rPr>
+        <w:t xml:space="preserve">Narzędzia (Linear, automatyzacja, CI) wspierały pracę.    </w:t>
+      </w:r>
+      <w:r>
+        <w:rPr>
+          <w:rFonts w:ascii="Calibri" w:hAnsi="Calibri"/>
+          <w:color w:val="555555"/>
+          <w:sz w:val="22"/>
+        </w:rPr>
+        <w:t>Ocena (1-5):  1   2   3   4   5</w:t>
+      </w:r>
+    </w:p>
+    <w:p>
+      <w:pPr>
+        <w:spacing w:after="80"/>
+      </w:pPr>
+      <w:r>
+        <w:rPr>
+          <w:rFonts w:ascii="Calibri" w:hAnsi="Calibri"/>
+          <w:color w:val="1A1A1A"/>
+          <w:sz w:val="22"/>
+        </w:rPr>
+        <w:t xml:space="preserve">Blockery były rozwiązywane na bieżąco.    </w:t>
+      </w:r>
+      <w:r>
+        <w:rPr>
+          <w:rFonts w:ascii="Calibri" w:hAnsi="Calibri"/>
+          <w:color w:val="555555"/>
+          <w:sz w:val="22"/>
+        </w:rPr>
+        <w:t>Ocena (1-5):  1   2   3   4   5</w:t>
+      </w:r>
+    </w:p>
+    <w:p>
+      <w:pPr>
+        <w:spacing w:after="120"/>
+      </w:pPr>
+      <w:r>
+        <w:rPr>
+          <w:rFonts w:ascii="Calibri" w:hAnsi="Calibri"/>
+          <w:i w:val="0"/>
+          <w:color w:val="1F4E79"/>
+          <w:sz w:val="22"/>
+        </w:rPr>
+        <w:t>Pytania otwarte:</w:t>
+      </w:r>
+    </w:p>
+    <w:p>
+      <w:pPr>
+        <w:spacing w:after="40"/>
+      </w:pPr>
+      <w:r>
+        <w:rPr>
+          <w:rFonts w:ascii="Calibri" w:hAnsi="Calibri"/>
+          <w:color w:val="1A1A1A"/>
+          <w:sz w:val="22"/>
+        </w:rPr>
+        <w:t>Co działało najlepiej?</w:t>
+      </w:r>
+    </w:p>
+    <w:p>
+      <w:pPr>
+        <w:spacing w:after="160"/>
+      </w:pPr>
+      <w:r>
+        <w:rPr>
+          <w:color w:val="BBBBBB"/>
+          <w:sz w:val="22"/>
+        </w:rPr>
+        <w:t>_______________________________________________________________________________________________</w:t>
+      </w:r>
+    </w:p>
+    <w:p>
+      <w:pPr>
+        <w:spacing w:after="40"/>
+      </w:pPr>
+      <w:r>
+        <w:rPr>
+          <w:rFonts w:ascii="Calibri" w:hAnsi="Calibri"/>
+          <w:color w:val="1A1A1A"/>
+          <w:sz w:val="22"/>
+        </w:rPr>
+        <w:t>Co najbardziej przeszkadzało lub blokowało pracę?</w:t>
+      </w:r>
+    </w:p>
+    <w:p>
+      <w:pPr>
+        <w:spacing w:after="160"/>
+      </w:pPr>
+      <w:r>
+        <w:rPr>
+          <w:color w:val="BBBBBB"/>
+          <w:sz w:val="22"/>
+        </w:rPr>
+        <w:t>_______________________________________________________________________________________________</w:t>
+      </w:r>
+    </w:p>
+    <w:p>
+      <w:pPr>
+        <w:spacing w:after="40"/>
+      </w:pPr>
+      <w:r>
+        <w:rPr>
+          <w:rFonts w:ascii="Calibri" w:hAnsi="Calibri"/>
+          <w:color w:val="1A1A1A"/>
+          <w:sz w:val="22"/>
+        </w:rPr>
+        <w:t>Co zmienilibyśmy w kolejnym projekcie?</w:t>
+      </w:r>
+    </w:p>
+    <w:p>
+      <w:pPr>
+        <w:spacing w:after="160"/>
+      </w:pPr>
+      <w:r>
+        <w:rPr>
+          <w:color w:val="BBBBBB"/>
+          <w:sz w:val="22"/>
+        </w:rPr>
+        <w:t>_______________________________________________________________________________________________</w:t>
       </w:r>
     </w:p>
     <w:sectPr>

</xml_diff>

<commit_message>
docs: drop stats charts, show survey results instead of questions
Co-Authored-By: Claude Opus 4.8 (1M context) <noreply@anthropic.com>
</commit_message>
<xml_diff>
--- a/docs/cogniro-retrospektywa.docx
+++ b/docs/cogniro-retrospektywa.docx
@@ -307,115 +307,7 @@
           <w:color w:val="1F4E79"/>
           <w:sz w:val="30"/>
         </w:rPr>
-        <w:t>Statystyki projektu</w:t>
-      </w:r>
-    </w:p>
-    <w:p>
-      <w:pPr>
-        <w:spacing w:after="200"/>
-      </w:pPr>
-      <w:r>
-        <w:rPr>
-          <w:rFonts w:ascii="Calibri" w:hAnsi="Calibri"/>
-          <w:i/>
-          <w:color w:val="555555"/>
-          <w:sz w:val="20"/>
-        </w:rPr>
-        <w:t>Okres realizacji: 10.03–13.06.2026 (ok. 3 miesiące).  Zmergowanych PR-ów: 36.  Kontrybutorów: 6.  Commitów na gałęzi main: 37.</w:t>
-      </w:r>
-    </w:p>
-    <w:p>
-      <w:pPr>
-        <w:spacing w:after="200"/>
-        <w:jc w:val="center"/>
-      </w:pPr>
-      <w:r>
-        <w:drawing>
-          <wp:inline xmlns:a="http://schemas.openxmlformats.org/drawingml/2006/main" xmlns:pic="http://schemas.openxmlformats.org/drawingml/2006/picture">
-            <wp:extent cx="5760000" cy="2488889"/>
-            <wp:docPr id="1" name="Picture 1"/>
-            <wp:cNvGraphicFramePr>
-              <a:graphicFrameLocks noChangeAspect="1"/>
-            </wp:cNvGraphicFramePr>
-            <a:graphic>
-              <a:graphicData uri="http://schemas.openxmlformats.org/drawingml/2006/picture">
-                <pic:pic>
-                  <pic:nvPicPr>
-                    <pic:cNvPr id="0" name="chart_authors.png"/>
-                    <pic:cNvPicPr/>
-                  </pic:nvPicPr>
-                  <pic:blipFill>
-                    <a:blip r:embed="rId9"/>
-                    <a:stretch>
-                      <a:fillRect/>
-                    </a:stretch>
-                  </pic:blipFill>
-                  <pic:spPr>
-                    <a:xfrm>
-                      <a:off x="0" y="0"/>
-                      <a:ext cx="5760000" cy="2488889"/>
-                    </a:xfrm>
-                    <a:prstGeom prst="rect"/>
-                  </pic:spPr>
-                </pic:pic>
-              </a:graphicData>
-            </a:graphic>
-          </wp:inline>
-        </w:drawing>
-      </w:r>
-    </w:p>
-    <w:p>
-      <w:pPr>
-        <w:spacing w:after="200"/>
-        <w:jc w:val="center"/>
-      </w:pPr>
-      <w:r>
-        <w:drawing>
-          <wp:inline xmlns:a="http://schemas.openxmlformats.org/drawingml/2006/main" xmlns:pic="http://schemas.openxmlformats.org/drawingml/2006/picture">
-            <wp:extent cx="5760000" cy="2346667"/>
-            <wp:docPr id="2" name="Picture 2"/>
-            <wp:cNvGraphicFramePr>
-              <a:graphicFrameLocks noChangeAspect="1"/>
-            </wp:cNvGraphicFramePr>
-            <a:graphic>
-              <a:graphicData uri="http://schemas.openxmlformats.org/drawingml/2006/picture">
-                <pic:pic>
-                  <pic:nvPicPr>
-                    <pic:cNvPr id="0" name="chart_timeline.png"/>
-                    <pic:cNvPicPr/>
-                  </pic:nvPicPr>
-                  <pic:blipFill>
-                    <a:blip r:embed="rId10"/>
-                    <a:stretch>
-                      <a:fillRect/>
-                    </a:stretch>
-                  </pic:blipFill>
-                  <pic:spPr>
-                    <a:xfrm>
-                      <a:off x="0" y="0"/>
-                      <a:ext cx="5760000" cy="2346667"/>
-                    </a:xfrm>
-                    <a:prstGeom prst="rect"/>
-                  </pic:spPr>
-                </pic:pic>
-              </a:graphicData>
-            </a:graphic>
-          </wp:inline>
-        </w:drawing>
-      </w:r>
-    </w:p>
-    <w:p>
-      <w:pPr>
-        <w:spacing w:before="280" w:after="120"/>
-      </w:pPr>
-      <w:r>
-        <w:rPr>
-          <w:rFonts w:ascii="Calibri" w:hAnsi="Calibri"/>
-          <w:b/>
-          <w:color w:val="1F4E79"/>
-          <w:sz w:val="30"/>
-        </w:rPr>
-        <w:t>Ankieta zespołowa</w:t>
+        <w:t>Wyniki ankiety zespołowej</w:t>
       </w:r>
     </w:p>
     <w:p>
@@ -429,9 +321,505 @@
           <w:color w:val="555555"/>
           <w:sz w:val="20"/>
         </w:rPr>
-        <w:t>Krótka ankieta do wypełnienia przez członków zespołu. Skala 1-5, gdzie 1 = zdecydowanie nie, 5 = zdecydowanie tak.</w:t>
+        <w:t>Ankieta wśród członków zespołu (6 odpowiedzi). Skala 1-5, gdzie 1 = zdecydowanie nie, 5 = zdecydowanie tak.</w:t>
       </w:r>
     </w:p>
+    <w:tbl>
+      <w:tblPr>
+        <w:tblStyle w:val="TableGrid"/>
+        <w:tblW w:type="auto" w:w="0"/>
+        <w:tblLook w:firstColumn="1" w:firstRow="1" w:lastColumn="0" w:lastRow="0" w:noHBand="0" w:noVBand="1" w:val="04A0"/>
+      </w:tblPr>
+      <w:tblGrid>
+        <w:gridCol w:w="5953"/>
+        <w:gridCol w:w="1247"/>
+        <w:gridCol w:w="2154"/>
+      </w:tblGrid>
+      <w:tr>
+        <w:tc>
+          <w:tcPr>
+            <w:tcW w:type="dxa" w:w="3227"/>
+            <w:shd w:val="clear" w:color="auto" w:fill="1F4E79"/>
+          </w:tcPr>
+          <w:p>
+            <w:r/>
+            <w:r>
+              <w:rPr>
+                <w:rFonts w:ascii="Calibri" w:hAnsi="Calibri"/>
+                <w:b/>
+                <w:color w:val="FFFFFF"/>
+                <w:sz w:val="22"/>
+              </w:rPr>
+              <w:t>Pytanie</w:t>
+            </w:r>
+          </w:p>
+        </w:tc>
+        <w:tc>
+          <w:tcPr>
+            <w:tcW w:type="dxa" w:w="3227"/>
+            <w:shd w:val="clear" w:color="auto" w:fill="1F4E79"/>
+          </w:tcPr>
+          <w:p>
+            <w:pPr>
+              <w:jc w:val="center"/>
+            </w:pPr>
+            <w:r/>
+            <w:r>
+              <w:rPr>
+                <w:rFonts w:ascii="Calibri" w:hAnsi="Calibri"/>
+                <w:b/>
+                <w:color w:val="FFFFFF"/>
+                <w:sz w:val="22"/>
+              </w:rPr>
+              <w:t>Średnia</w:t>
+            </w:r>
+          </w:p>
+        </w:tc>
+        <w:tc>
+          <w:tcPr>
+            <w:tcW w:type="dxa" w:w="3227"/>
+            <w:shd w:val="clear" w:color="auto" w:fill="1F4E79"/>
+          </w:tcPr>
+          <w:p>
+            <w:pPr>
+              <w:jc w:val="center"/>
+            </w:pPr>
+            <w:r/>
+            <w:r>
+              <w:rPr>
+                <w:rFonts w:ascii="Calibri" w:hAnsi="Calibri"/>
+                <w:b/>
+                <w:color w:val="FFFFFF"/>
+                <w:sz w:val="22"/>
+              </w:rPr>
+              <w:t>Wynik</w:t>
+            </w:r>
+          </w:p>
+        </w:tc>
+      </w:tr>
+      <w:tr>
+        <w:tc>
+          <w:tcPr>
+            <w:tcW w:type="dxa" w:w="5953"/>
+          </w:tcPr>
+          <w:p>
+            <w:r/>
+            <w:r>
+              <w:rPr>
+                <w:rFonts w:ascii="Calibri" w:hAnsi="Calibri"/>
+                <w:b w:val="0"/>
+                <w:color w:val="1A1A1A"/>
+                <w:sz w:val="22"/>
+              </w:rPr>
+              <w:t>Estymaty czasu były realistyczne.</w:t>
+            </w:r>
+          </w:p>
+        </w:tc>
+        <w:tc>
+          <w:tcPr>
+            <w:tcW w:type="dxa" w:w="1247"/>
+          </w:tcPr>
+          <w:p>
+            <w:pPr>
+              <w:jc w:val="center"/>
+            </w:pPr>
+            <w:r/>
+            <w:r>
+              <w:rPr>
+                <w:rFonts w:ascii="Calibri" w:hAnsi="Calibri"/>
+                <w:b/>
+                <w:color w:val="1F4E79"/>
+                <w:sz w:val="22"/>
+              </w:rPr>
+              <w:t>2.3 / 5</w:t>
+            </w:r>
+          </w:p>
+        </w:tc>
+        <w:tc>
+          <w:tcPr>
+            <w:tcW w:type="dxa" w:w="2154"/>
+          </w:tcPr>
+          <w:p>
+            <w:pPr>
+              <w:jc w:val="center"/>
+            </w:pPr>
+            <w:r/>
+            <w:r>
+              <w:rPr>
+                <w:rFonts w:ascii="Consolas" w:hAnsi="Consolas"/>
+                <w:b w:val="0"/>
+                <w:color w:val="E8B44F"/>
+                <w:sz w:val="22"/>
+              </w:rPr>
+              <w:t>█████░░░░░</w:t>
+            </w:r>
+          </w:p>
+        </w:tc>
+      </w:tr>
+      <w:tr>
+        <w:tc>
+          <w:tcPr>
+            <w:tcW w:type="dxa" w:w="5953"/>
+            <w:shd w:val="clear" w:color="auto" w:fill="F4F8FC"/>
+          </w:tcPr>
+          <w:p>
+            <w:r/>
+            <w:r>
+              <w:rPr>
+                <w:rFonts w:ascii="Calibri" w:hAnsi="Calibri"/>
+                <w:b w:val="0"/>
+                <w:color w:val="1A1A1A"/>
+                <w:sz w:val="22"/>
+              </w:rPr>
+              <w:t>Podział dużych zadań na mniejsze usprawniał pracę.</w:t>
+            </w:r>
+          </w:p>
+        </w:tc>
+        <w:tc>
+          <w:tcPr>
+            <w:tcW w:type="dxa" w:w="1247"/>
+            <w:shd w:val="clear" w:color="auto" w:fill="F4F8FC"/>
+          </w:tcPr>
+          <w:p>
+            <w:pPr>
+              <w:jc w:val="center"/>
+            </w:pPr>
+            <w:r/>
+            <w:r>
+              <w:rPr>
+                <w:rFonts w:ascii="Calibri" w:hAnsi="Calibri"/>
+                <w:b/>
+                <w:color w:val="1F4E79"/>
+                <w:sz w:val="22"/>
+              </w:rPr>
+              <w:t>4.5 / 5</w:t>
+            </w:r>
+          </w:p>
+        </w:tc>
+        <w:tc>
+          <w:tcPr>
+            <w:tcW w:type="dxa" w:w="2154"/>
+            <w:shd w:val="clear" w:color="auto" w:fill="F4F8FC"/>
+          </w:tcPr>
+          <w:p>
+            <w:pPr>
+              <w:jc w:val="center"/>
+            </w:pPr>
+            <w:r/>
+            <w:r>
+              <w:rPr>
+                <w:rFonts w:ascii="Consolas" w:hAnsi="Consolas"/>
+                <w:b w:val="0"/>
+                <w:color w:val="E8B44F"/>
+                <w:sz w:val="22"/>
+              </w:rPr>
+              <w:t>█████████░</w:t>
+            </w:r>
+          </w:p>
+        </w:tc>
+      </w:tr>
+      <w:tr>
+        <w:tc>
+          <w:tcPr>
+            <w:tcW w:type="dxa" w:w="5953"/>
+          </w:tcPr>
+          <w:p>
+            <w:r/>
+            <w:r>
+              <w:rPr>
+                <w:rFonts w:ascii="Calibri" w:hAnsi="Calibri"/>
+                <w:b w:val="0"/>
+                <w:color w:val="1A1A1A"/>
+                <w:sz w:val="22"/>
+              </w:rPr>
+              <w:t>Obciążenie rolą QA było rozłożone sprawiedliwie.</w:t>
+            </w:r>
+          </w:p>
+        </w:tc>
+        <w:tc>
+          <w:tcPr>
+            <w:tcW w:type="dxa" w:w="1247"/>
+          </w:tcPr>
+          <w:p>
+            <w:pPr>
+              <w:jc w:val="center"/>
+            </w:pPr>
+            <w:r/>
+            <w:r>
+              <w:rPr>
+                <w:rFonts w:ascii="Calibri" w:hAnsi="Calibri"/>
+                <w:b/>
+                <w:color w:val="1F4E79"/>
+                <w:sz w:val="22"/>
+              </w:rPr>
+              <w:t>2.2 / 5</w:t>
+            </w:r>
+          </w:p>
+        </w:tc>
+        <w:tc>
+          <w:tcPr>
+            <w:tcW w:type="dxa" w:w="2154"/>
+          </w:tcPr>
+          <w:p>
+            <w:pPr>
+              <w:jc w:val="center"/>
+            </w:pPr>
+            <w:r/>
+            <w:r>
+              <w:rPr>
+                <w:rFonts w:ascii="Consolas" w:hAnsi="Consolas"/>
+                <w:b w:val="0"/>
+                <w:color w:val="E8B44F"/>
+                <w:sz w:val="22"/>
+              </w:rPr>
+              <w:t>████░░░░░░</w:t>
+            </w:r>
+          </w:p>
+        </w:tc>
+      </w:tr>
+      <w:tr>
+        <w:tc>
+          <w:tcPr>
+            <w:tcW w:type="dxa" w:w="5953"/>
+            <w:shd w:val="clear" w:color="auto" w:fill="F4F8FC"/>
+          </w:tcPr>
+          <w:p>
+            <w:r/>
+            <w:r>
+              <w:rPr>
+                <w:rFonts w:ascii="Calibri" w:hAnsi="Calibri"/>
+                <w:b w:val="0"/>
+                <w:color w:val="1A1A1A"/>
+                <w:sz w:val="22"/>
+              </w:rPr>
+              <w:t>Komunikacja w zespole była efektywna.</w:t>
+            </w:r>
+          </w:p>
+        </w:tc>
+        <w:tc>
+          <w:tcPr>
+            <w:tcW w:type="dxa" w:w="1247"/>
+            <w:shd w:val="clear" w:color="auto" w:fill="F4F8FC"/>
+          </w:tcPr>
+          <w:p>
+            <w:pPr>
+              <w:jc w:val="center"/>
+            </w:pPr>
+            <w:r/>
+            <w:r>
+              <w:rPr>
+                <w:rFonts w:ascii="Calibri" w:hAnsi="Calibri"/>
+                <w:b/>
+                <w:color w:val="1F4E79"/>
+                <w:sz w:val="22"/>
+              </w:rPr>
+              <w:t>4.5 / 5</w:t>
+            </w:r>
+          </w:p>
+        </w:tc>
+        <w:tc>
+          <w:tcPr>
+            <w:tcW w:type="dxa" w:w="2154"/>
+            <w:shd w:val="clear" w:color="auto" w:fill="F4F8FC"/>
+          </w:tcPr>
+          <w:p>
+            <w:pPr>
+              <w:jc w:val="center"/>
+            </w:pPr>
+            <w:r/>
+            <w:r>
+              <w:rPr>
+                <w:rFonts w:ascii="Consolas" w:hAnsi="Consolas"/>
+                <w:b w:val="0"/>
+                <w:color w:val="E8B44F"/>
+                <w:sz w:val="22"/>
+              </w:rPr>
+              <w:t>█████████░</w:t>
+            </w:r>
+          </w:p>
+        </w:tc>
+      </w:tr>
+      <w:tr>
+        <w:tc>
+          <w:tcPr>
+            <w:tcW w:type="dxa" w:w="5953"/>
+          </w:tcPr>
+          <w:p>
+            <w:r/>
+            <w:r>
+              <w:rPr>
+                <w:rFonts w:ascii="Calibri" w:hAnsi="Calibri"/>
+                <w:b w:val="0"/>
+                <w:color w:val="1A1A1A"/>
+                <w:sz w:val="22"/>
+              </w:rPr>
+              <w:t>Cotygodniowe spotkania były przydatne.</w:t>
+            </w:r>
+          </w:p>
+        </w:tc>
+        <w:tc>
+          <w:tcPr>
+            <w:tcW w:type="dxa" w:w="1247"/>
+          </w:tcPr>
+          <w:p>
+            <w:pPr>
+              <w:jc w:val="center"/>
+            </w:pPr>
+            <w:r/>
+            <w:r>
+              <w:rPr>
+                <w:rFonts w:ascii="Calibri" w:hAnsi="Calibri"/>
+                <w:b/>
+                <w:color w:val="1F4E79"/>
+                <w:sz w:val="22"/>
+              </w:rPr>
+              <w:t>4.7 / 5</w:t>
+            </w:r>
+          </w:p>
+        </w:tc>
+        <w:tc>
+          <w:tcPr>
+            <w:tcW w:type="dxa" w:w="2154"/>
+          </w:tcPr>
+          <w:p>
+            <w:pPr>
+              <w:jc w:val="center"/>
+            </w:pPr>
+            <w:r/>
+            <w:r>
+              <w:rPr>
+                <w:rFonts w:ascii="Consolas" w:hAnsi="Consolas"/>
+                <w:b w:val="0"/>
+                <w:color w:val="E8B44F"/>
+                <w:sz w:val="22"/>
+              </w:rPr>
+              <w:t>█████████░</w:t>
+            </w:r>
+          </w:p>
+        </w:tc>
+      </w:tr>
+      <w:tr>
+        <w:tc>
+          <w:tcPr>
+            <w:tcW w:type="dxa" w:w="5953"/>
+            <w:shd w:val="clear" w:color="auto" w:fill="F4F8FC"/>
+          </w:tcPr>
+          <w:p>
+            <w:r/>
+            <w:r>
+              <w:rPr>
+                <w:rFonts w:ascii="Calibri" w:hAnsi="Calibri"/>
+                <w:b w:val="0"/>
+                <w:color w:val="1A1A1A"/>
+                <w:sz w:val="22"/>
+              </w:rPr>
+              <w:t>Narzędzia (Linear, automatyzacja, CI) wspierały pracę.</w:t>
+            </w:r>
+          </w:p>
+        </w:tc>
+        <w:tc>
+          <w:tcPr>
+            <w:tcW w:type="dxa" w:w="1247"/>
+            <w:shd w:val="clear" w:color="auto" w:fill="F4F8FC"/>
+          </w:tcPr>
+          <w:p>
+            <w:pPr>
+              <w:jc w:val="center"/>
+            </w:pPr>
+            <w:r/>
+            <w:r>
+              <w:rPr>
+                <w:rFonts w:ascii="Calibri" w:hAnsi="Calibri"/>
+                <w:b/>
+                <w:color w:val="1F4E79"/>
+                <w:sz w:val="22"/>
+              </w:rPr>
+              <w:t>4.6 / 5</w:t>
+            </w:r>
+          </w:p>
+        </w:tc>
+        <w:tc>
+          <w:tcPr>
+            <w:tcW w:type="dxa" w:w="2154"/>
+            <w:shd w:val="clear" w:color="auto" w:fill="F4F8FC"/>
+          </w:tcPr>
+          <w:p>
+            <w:pPr>
+              <w:jc w:val="center"/>
+            </w:pPr>
+            <w:r/>
+            <w:r>
+              <w:rPr>
+                <w:rFonts w:ascii="Consolas" w:hAnsi="Consolas"/>
+                <w:b w:val="0"/>
+                <w:color w:val="E8B44F"/>
+                <w:sz w:val="22"/>
+              </w:rPr>
+              <w:t>█████████░</w:t>
+            </w:r>
+          </w:p>
+        </w:tc>
+      </w:tr>
+      <w:tr>
+        <w:tc>
+          <w:tcPr>
+            <w:tcW w:type="dxa" w:w="5953"/>
+          </w:tcPr>
+          <w:p>
+            <w:r/>
+            <w:r>
+              <w:rPr>
+                <w:rFonts w:ascii="Calibri" w:hAnsi="Calibri"/>
+                <w:b w:val="0"/>
+                <w:color w:val="1A1A1A"/>
+                <w:sz w:val="22"/>
+              </w:rPr>
+              <w:t>Blockery były rozwiązywane na bieżąco.</w:t>
+            </w:r>
+          </w:p>
+        </w:tc>
+        <w:tc>
+          <w:tcPr>
+            <w:tcW w:type="dxa" w:w="1247"/>
+          </w:tcPr>
+          <w:p>
+            <w:pPr>
+              <w:jc w:val="center"/>
+            </w:pPr>
+            <w:r/>
+            <w:r>
+              <w:rPr>
+                <w:rFonts w:ascii="Calibri" w:hAnsi="Calibri"/>
+                <w:b/>
+                <w:color w:val="1F4E79"/>
+                <w:sz w:val="22"/>
+              </w:rPr>
+              <w:t>3.2 / 5</w:t>
+            </w:r>
+          </w:p>
+        </w:tc>
+        <w:tc>
+          <w:tcPr>
+            <w:tcW w:type="dxa" w:w="2154"/>
+          </w:tcPr>
+          <w:p>
+            <w:pPr>
+              <w:jc w:val="center"/>
+            </w:pPr>
+            <w:r/>
+            <w:r>
+              <w:rPr>
+                <w:rFonts w:ascii="Consolas" w:hAnsi="Consolas"/>
+                <w:b w:val="0"/>
+                <w:color w:val="E8B44F"/>
+                <w:sz w:val="22"/>
+              </w:rPr>
+              <w:t>██████░░░░</w:t>
+            </w:r>
+          </w:p>
+        </w:tc>
+      </w:tr>
+    </w:tbl>
     <w:p>
       <w:pPr>
         <w:spacing w:after="80"/>
@@ -439,144 +827,25 @@
       <w:r>
         <w:rPr>
           <w:rFonts w:ascii="Calibri" w:hAnsi="Calibri"/>
-          <w:color w:val="1A1A1A"/>
+          <w:i w:val="0"/>
+          <w:color w:val="1F4E79"/>
           <w:sz w:val="22"/>
         </w:rPr>
-        <w:t xml:space="preserve">Estymaty czasu były realistyczne.    </w:t>
-      </w:r>
-      <w:r>
-        <w:rPr>
-          <w:rFonts w:ascii="Calibri" w:hAnsi="Calibri"/>
-          <w:color w:val="555555"/>
-          <w:sz w:val="22"/>
-        </w:rPr>
-        <w:t>Ocena (1-5):  1   2   3   4   5</w:t>
+        <w:t>Pytania otwarte — podsumowanie odpowiedzi:</w:t>
       </w:r>
     </w:p>
     <w:p>
       <w:pPr>
-        <w:spacing w:after="80"/>
+        <w:spacing w:before="120" w:after="20"/>
       </w:pPr>
       <w:r>
         <w:rPr>
           <w:rFonts w:ascii="Calibri" w:hAnsi="Calibri"/>
-          <w:color w:val="1A1A1A"/>
+          <w:b/>
+          <w:color w:val="1F4E79"/>
           <w:sz w:val="22"/>
         </w:rPr>
-        <w:t xml:space="preserve">Podział dużych zadań na mniejsze usprawniał pracę.    </w:t>
-      </w:r>
-      <w:r>
-        <w:rPr>
-          <w:rFonts w:ascii="Calibri" w:hAnsi="Calibri"/>
-          <w:color w:val="555555"/>
-          <w:sz w:val="22"/>
-        </w:rPr>
-        <w:t>Ocena (1-5):  1   2   3   4   5</w:t>
-      </w:r>
-    </w:p>
-    <w:p>
-      <w:pPr>
-        <w:spacing w:after="80"/>
-      </w:pPr>
-      <w:r>
-        <w:rPr>
-          <w:rFonts w:ascii="Calibri" w:hAnsi="Calibri"/>
-          <w:color w:val="1A1A1A"/>
-          <w:sz w:val="22"/>
-        </w:rPr>
-        <w:t xml:space="preserve">Obciążenie rolą QA było rozłożone sprawiedliwie.    </w:t>
-      </w:r>
-      <w:r>
-        <w:rPr>
-          <w:rFonts w:ascii="Calibri" w:hAnsi="Calibri"/>
-          <w:color w:val="555555"/>
-          <w:sz w:val="22"/>
-        </w:rPr>
-        <w:t>Ocena (1-5):  1   2   3   4   5</w:t>
-      </w:r>
-    </w:p>
-    <w:p>
-      <w:pPr>
-        <w:spacing w:after="80"/>
-      </w:pPr>
-      <w:r>
-        <w:rPr>
-          <w:rFonts w:ascii="Calibri" w:hAnsi="Calibri"/>
-          <w:color w:val="1A1A1A"/>
-          <w:sz w:val="22"/>
-        </w:rPr>
-        <w:t xml:space="preserve">Komunikacja w zespole była efektywna.    </w:t>
-      </w:r>
-      <w:r>
-        <w:rPr>
-          <w:rFonts w:ascii="Calibri" w:hAnsi="Calibri"/>
-          <w:color w:val="555555"/>
-          <w:sz w:val="22"/>
-        </w:rPr>
-        <w:t>Ocena (1-5):  1   2   3   4   5</w:t>
-      </w:r>
-    </w:p>
-    <w:p>
-      <w:pPr>
-        <w:spacing w:after="80"/>
-      </w:pPr>
-      <w:r>
-        <w:rPr>
-          <w:rFonts w:ascii="Calibri" w:hAnsi="Calibri"/>
-          <w:color w:val="1A1A1A"/>
-          <w:sz w:val="22"/>
-        </w:rPr>
-        <w:t xml:space="preserve">Cotygodniowe spotkania były przydatne.    </w:t>
-      </w:r>
-      <w:r>
-        <w:rPr>
-          <w:rFonts w:ascii="Calibri" w:hAnsi="Calibri"/>
-          <w:color w:val="555555"/>
-          <w:sz w:val="22"/>
-        </w:rPr>
-        <w:t>Ocena (1-5):  1   2   3   4   5</w:t>
-      </w:r>
-    </w:p>
-    <w:p>
-      <w:pPr>
-        <w:spacing w:after="80"/>
-      </w:pPr>
-      <w:r>
-        <w:rPr>
-          <w:rFonts w:ascii="Calibri" w:hAnsi="Calibri"/>
-          <w:color w:val="1A1A1A"/>
-          <w:sz w:val="22"/>
-        </w:rPr>
-        <w:t xml:space="preserve">Narzędzia (Linear, automatyzacja, CI) wspierały pracę.    </w:t>
-      </w:r>
-      <w:r>
-        <w:rPr>
-          <w:rFonts w:ascii="Calibri" w:hAnsi="Calibri"/>
-          <w:color w:val="555555"/>
-          <w:sz w:val="22"/>
-        </w:rPr>
-        <w:t>Ocena (1-5):  1   2   3   4   5</w:t>
-      </w:r>
-    </w:p>
-    <w:p>
-      <w:pPr>
-        <w:spacing w:after="80"/>
-      </w:pPr>
-      <w:r>
-        <w:rPr>
-          <w:rFonts w:ascii="Calibri" w:hAnsi="Calibri"/>
-          <w:color w:val="1A1A1A"/>
-          <w:sz w:val="22"/>
-        </w:rPr>
-        <w:t xml:space="preserve">Blockery były rozwiązywane na bieżąco.    </w:t>
-      </w:r>
-      <w:r>
-        <w:rPr>
-          <w:rFonts w:ascii="Calibri" w:hAnsi="Calibri"/>
-          <w:color w:val="555555"/>
-          <w:sz w:val="22"/>
-        </w:rPr>
-        <w:t>Ocena (1-5):  1   2   3   4   5</w:t>
+        <w:t>Co działało najlepiej?</w:t>
       </w:r>
     </w:p>
     <w:p>
@@ -586,16 +855,29 @@
       <w:r>
         <w:rPr>
           <w:rFonts w:ascii="Calibri" w:hAnsi="Calibri"/>
-          <w:i w:val="0"/>
-          <w:color w:val="1F4E79"/>
+          <w:color w:val="1A1A1A"/>
           <w:sz w:val="22"/>
         </w:rPr>
-        <w:t>Pytania otwarte:</w:t>
+        <w:t>Luźna atmosfera i zgrany zespół, dobra komunikacja oraz cotygodniowe spotkania, narzędzia (Linear, automatyzacja, CI) i podział dużych zadań na mniejsze.</w:t>
       </w:r>
     </w:p>
     <w:p>
       <w:pPr>
-        <w:spacing w:after="40"/>
+        <w:spacing w:before="120" w:after="20"/>
+      </w:pPr>
+      <w:r>
+        <w:rPr>
+          <w:rFonts w:ascii="Calibri" w:hAnsi="Calibri"/>
+          <w:b/>
+          <w:color w:val="1F4E79"/>
+          <w:sz w:val="22"/>
+        </w:rPr>
+        <w:t>Co najbardziej przeszkadzało lub blokowało pracę?</w:t>
+      </w:r>
+    </w:p>
+    <w:p>
+      <w:pPr>
+        <w:spacing w:after="120"/>
       </w:pPr>
       <w:r>
         <w:rPr>
@@ -603,24 +885,26 @@
           <w:color w:val="1A1A1A"/>
           <w:sz w:val="22"/>
         </w:rPr>
-        <w:t>Co działało najlepiej?</w:t>
+        <w:t>Wzajemne zależności między zadaniami, wąskie gardło review/QA, nierealistyczne estymaty początkowe oraz przeciążona rola QA.</w:t>
       </w:r>
     </w:p>
     <w:p>
       <w:pPr>
-        <w:spacing w:after="160"/>
+        <w:spacing w:before="120" w:after="20"/>
       </w:pPr>
       <w:r>
         <w:rPr>
-          <w:color w:val="BBBBBB"/>
+          <w:rFonts w:ascii="Calibri" w:hAnsi="Calibri"/>
+          <w:b/>
+          <w:color w:val="1F4E79"/>
           <w:sz w:val="22"/>
         </w:rPr>
-        <w:t>_______________________________________________________________________________________________</w:t>
+        <w:t>Co zmienilibyśmy w kolejnym projekcie?</w:t>
       </w:r>
     </w:p>
     <w:p>
       <w:pPr>
-        <w:spacing w:after="40"/>
+        <w:spacing w:after="120"/>
       </w:pPr>
       <w:r>
         <w:rPr>
@@ -628,44 +912,7 @@
           <w:color w:val="1A1A1A"/>
           <w:sz w:val="22"/>
         </w:rPr>
-        <w:t>Co najbardziej przeszkadzało lub blokowało pracę?</w:t>
-      </w:r>
-    </w:p>
-    <w:p>
-      <w:pPr>
-        <w:spacing w:after="160"/>
-      </w:pPr>
-      <w:r>
-        <w:rPr>
-          <w:color w:val="BBBBBB"/>
-          <w:sz w:val="22"/>
-        </w:rPr>
-        <w:t>_______________________________________________________________________________________________</w:t>
-      </w:r>
-    </w:p>
-    <w:p>
-      <w:pPr>
-        <w:spacing w:after="40"/>
-      </w:pPr>
-      <w:r>
-        <w:rPr>
-          <w:rFonts w:ascii="Calibri" w:hAnsi="Calibri"/>
-          <w:color w:val="1A1A1A"/>
-          <w:sz w:val="22"/>
-        </w:rPr>
-        <w:t>Co zmienilibyśmy w kolejnym projekcie?</w:t>
-      </w:r>
-    </w:p>
-    <w:p>
-      <w:pPr>
-        <w:spacing w:after="160"/>
-      </w:pPr>
-      <w:r>
-        <w:rPr>
-          <w:color w:val="BBBBBB"/>
-          <w:sz w:val="22"/>
-        </w:rPr>
-        <w:t>_______________________________________________________________________________________________</w:t>
+        <w:t>Dokładniejsze estymaty oparte na wcześniejszej analizie zadań, rozłożenie roli QA na cały zespół i wydzielenie osobnej roli UX, konsekwentne dzielenie ticketów na mniejsze.</w:t>
       </w:r>
     </w:p>
     <w:sectPr>

</xml_diff>